<commit_message>
Sync SRS/SDS report for dual-Act scope (ADR-023)
</commit_message>
<xml_diff>
--- a/docs/SRS_SDS_Report_CrossBorderTax.docx
+++ b/docs/SRS_SDS_Report_CrossBorderTax.docx
@@ -1538,10 +1538,25 @@
       </w:pPr>
       <w:r>
         <w:rPr>
+          <w:i/>
+          <w:iCs/>
           <w:sz w:val="22"/>
           <w:szCs w:val="22"/>
         </w:rPr>
-        <w:t xml:space="preserve">Freelancers and independent consultants based in India who earn consulting income from clients in the United States face a fragmented compliance landscape: they must reconcile multi-currency income, determine which business expenses are legally deductible, apply India's presumptive taxation scheme for professionals under Section 44ADA of the Income Tax Act, and invoke the India–US Double Taxation Avoidance Agreement (DTAA) to avoid being taxed twice on the same income. The rules governing this are spread across dense official publications — the Indian Income Tax Act, IRS guidance on source-of-income rules, and the treaty text itself — making consistent, correct interpretation difficult for a non-expert.</w:t>
+        <w:t xml:space="preserve">Scope note (2026-09-20): India enacted the Income-tax Act, 2025 [No. 30 of 2025], in force from FY2026-27, after this report was first drafted. The requirements and system design below reflect the resulting dual-Act scope (both the 1961 Act and the 2025 Act, selected by tax year) rather than the single-Act assumption this report originally carried — see the project’s DECISIONS.md (ADR-015/016) for the full reasoning.</w:t>
+      </w:r>
+    </w:p>
+    <w:p>
+      <w:pPr>
+        <w:spacing w:after="160" w:line="300"/>
+        <w:jc w:val="both"/>
+      </w:pPr>
+      <w:r>
+        <w:rPr>
+          <w:sz w:val="22"/>
+          <w:szCs w:val="22"/>
+        </w:rPr>
+        <w:t xml:space="preserve">Freelancers and independent consultants based in India who earn consulting income from clients in the United States face a fragmented compliance landscape: they must reconcile multi-currency income, determine which business expenses are legally deductible, apply India's presumptive taxation scheme for professionals under Section 44ADA of the Income-tax Act, 1961 (or its successor, Section 58 of the Income-tax Act, 2025, for tax years from FY2026-27 onward), and invoke the India–US Double Taxation Avoidance Agreement (DTAA) to avoid being taxed twice on the same income. The rules governing this are spread across dense official publications — the Indian Income Tax Act, IRS guidance on source-of-income rules, and the treaty text itself — making consistent, correct interpretation difficult for a non-expert.</w:t>
       </w:r>
     </w:p>
     <w:p>
@@ -1627,7 +1642,7 @@
           <w:sz w:val="22"/>
           <w:szCs w:val="22"/>
         </w:rPr>
-        <w:t xml:space="preserve">A Retrieval-Augmented Generation pipeline over a curated, version-tagged corpus of Indian IT Act provisions (Section 44ADA), the India–US DTAA text (Articles 15 and 25), and relevant IRS guidance, with retrieval constrained to the tax year in question.</w:t>
+        <w:t xml:space="preserve">A Retrieval-Augmented Generation pipeline over a curated, version-tagged corpus of Indian IT Act provisions (Section 44ADA under the 1961 Act; Section 58 under the Income-tax Act, 2025, for later tax years), the India–US DTAA text (Articles 15 and 25), and relevant IRS guidance, with retrieval constrained to the tax year in question.</w:t>
       </w:r>
     </w:p>
     <w:p>
@@ -1646,7 +1661,7 @@
           <w:sz w:val="22"/>
           <w:szCs w:val="22"/>
         </w:rPr>
-        <w:t xml:space="preserve">A deterministic, unit-tested tax engine that computes Section 44ADA presumptive income, applies the DTAA Article 15 “90-day” test, and calculates Article 25 foreign tax credit relief — all arithmetic performed in code, never by the language model.</w:t>
+        <w:t xml:space="preserve">A deterministic, unit-tested tax engine that computes presumptive income under the applicable Act’s scheme — Section 44ADA (Income-tax Act, 1961) through FY2025-26, Section 58 (Income-tax Act, 2025) from FY2026-27 onward, selected by tax year — including routing to the general-business presumptive scheme instead of outright rejection when a profession isn’t on the specified-profession list, applies the DTAA Article 15 “90-day” test, and calculates Article 25 foreign tax credit relief — all arithmetic performed in code, never by the language model.</w:t>
       </w:r>
     </w:p>
     <w:p>
@@ -2307,7 +2322,7 @@
                 <w:sz w:val="20"/>
                 <w:szCs w:val="20"/>
               </w:rPr>
-              <w:t xml:space="preserve">The system computes Indian presumptive tax under Section 44ADA for a given persona and tax year.</w:t>
+              <w:t xml:space="preserve">The system computes Indian presumptive tax under the applicable Act’s presumptive scheme for a given persona and tax year — Section 44ADA (Income-tax Act, 1961) through FY2025-26, Section 58 (Income-tax Act, 2025) from FY2026-27 onward — including routing to the general-business scheme instead of outright rejection when a profession isn’t on the specified-profession list.</w:t>
             </w:r>
           </w:p>
         </w:tc>
@@ -2704,6 +2719,50 @@
                 <w:szCs w:val="20"/>
               </w:rPr>
               <w:t xml:space="preserve">Every retrieval and computation decision is logged (rule version, chunks used, confidence) to support evaluation and the technical report.</w:t>
+            </w:r>
+          </w:p>
+        </w:tc>
+      </w:tr>
+      <w:tr>
+        <w:tc>
+          <w:tcPr>
+            <w:tcW w:type="dxa" w:w="1300"/>
+            <w:shd w:fill="FFFFFF" w:val="clear"/>
+            <w:tcMar>
+              <w:top w:type="dxa" w:w="70"/>
+              <w:left w:type="dxa" w:w="120"/>
+              <w:bottom w:type="dxa" w:w="70"/>
+              <w:right w:type="dxa" w:w="120"/>
+            </w:tcMar>
+          </w:tcPr>
+          <w:p>
+            <w:r>
+              <w:rPr>
+                <w:sz w:val="20"/>
+                <w:szCs w:val="20"/>
+              </w:rPr>
+              <w:t xml:space="preserve">FR-13</w:t>
+            </w:r>
+          </w:p>
+        </w:tc>
+        <w:tc>
+          <w:tcPr>
+            <w:tcW w:type="dxa" w:w="7726"/>
+            <w:shd w:fill="FFFFFF" w:val="clear"/>
+            <w:tcMar>
+              <w:top w:type="dxa" w:w="70"/>
+              <w:left w:type="dxa" w:w="120"/>
+              <w:bottom w:type="dxa" w:w="70"/>
+              <w:right w:type="dxa" w:w="120"/>
+            </w:tcMar>
+          </w:tcPr>
+          <w:p>
+            <w:r>
+              <w:rPr>
+                <w:sz w:val="20"/>
+                <w:szCs w:val="20"/>
+              </w:rPr>
+              <w:t xml:space="preserve">A partnership firm’s presumptive income (FR-3) is never further reduced by partner remuneration or any other Chapter IV-D deduction, regardless of what the partnership deed authorises — neither Section 44ADA/58 nor the general-business scheme (Section 44AD/58) carve this out, unlike the goods-carriage scheme.</w:t>
             </w:r>
           </w:p>
         </w:tc>
@@ -3643,7 +3702,7 @@
           <w:sz w:val="20"/>
           <w:szCs w:val="20"/>
         </w:rPr>
-        <w:t xml:space="preserve">Pydantic-validated calculation of Section 44ADA presumptive income and DTAA Article 15/25 relief; the only component permitted to produce a final number.</w:t>
+        <w:t xml:space="preserve">Pydantic-validated calculation of presumptive income under Section 44ADA (1961 Act) or Section 58 (Income-tax Act, 2025), selected by tax year, and DTAA Article 15/25 relief; the only component permitted to produce a final number.</w:t>
       </w:r>
     </w:p>
     <w:p>
@@ -4000,7 +4059,7 @@
           <w:sz w:val="20"/>
           <w:szCs w:val="20"/>
         </w:rPr>
-        <w:t xml:space="preserve">computed 44ADA liability and DTAA relief, each figure accompanied by its source citation.</w:t>
+        <w:t xml:space="preserve">computed presumptive-tax liability (Section 44ADA or Section 58, by tax year) and DTAA relief, each figure accompanied by its source citation.</w:t>
       </w:r>
     </w:p>
     <w:p>
@@ -4210,7 +4269,7 @@
           <w:sz w:val="22"/>
           <w:szCs w:val="22"/>
         </w:rPr>
-        <w:t xml:space="preserve">Example flow: a user requests a tax estimate; the backend retrieves tax-year-filtered rules, computes 44ADA and DTAA relief deterministically, verifies citations, logs the computation, and returns figures, citations, and an audit flag to the dashboard.</w:t>
+        <w:t xml:space="preserve">Example flow: a user requests a tax estimate; the backend retrieves tax-year-filtered rules, computes the applicable Act’s presumptive tax (Section 44ADA or Section 58) and DTAA relief deterministically, verifies citations, logs the computation, and returns figures, citations, and an audit flag to the dashboard.</w:t>
       </w:r>
     </w:p>
     <w:p>

</xml_diff>